<commit_message>
checkpoint before closing registration
</commit_message>
<xml_diff>
--- a/docs/source-data/רעיונות להמשך.docx
+++ b/docs/source-data/רעיונות להמשך.docx
@@ -5,24 +5,9 @@
     <w:p>
       <w:pPr>
         <w:bidi/>
-        <w:rPr>
-          <w:rtl/>
-        </w:rPr>
-      </w:pPr>
-    </w:p>
-    <w:p>
-      <w:pPr>
-        <w:bidi/>
-        <w:rPr>
-          <w:rtl/>
-        </w:rPr>
-      </w:pPr>
-    </w:p>
-    <w:p>
-      <w:pPr>
-        <w:bidi/>
         <w:jc w:val="center"/>
         <w:rPr>
+          <w:rFonts w:ascii="David" w:hAnsi="David" w:cs="David" w:hint="cs"/>
           <w:b/>
           <w:bCs/>
           <w:rtl/>
@@ -30,7 +15,7 @@
       </w:pPr>
       <w:r>
         <w:rPr>
-          <w:rFonts w:hint="cs"/>
+          <w:rFonts w:ascii="David" w:hAnsi="David" w:cs="David" w:hint="cs"/>
           <w:b/>
           <w:bCs/>
           <w:rtl/>
@@ -46,10 +31,13 @@
           <w:numId w:val="1"/>
         </w:numPr>
         <w:bidi/>
+        <w:rPr>
+          <w:rFonts w:ascii="David" w:hAnsi="David" w:cs="David" w:hint="cs"/>
+        </w:rPr>
       </w:pPr>
       <w:r>
         <w:rPr>
-          <w:rFonts w:hint="cs"/>
+          <w:rFonts w:ascii="David" w:hAnsi="David" w:cs="David" w:hint="cs"/>
           <w:rtl/>
         </w:rPr>
         <w:t>סרטון הסבר לשימוש</w:t>
@@ -63,36 +51,29 @@
           <w:numId w:val="1"/>
         </w:numPr>
         <w:bidi/>
+        <w:rPr>
+          <w:rFonts w:ascii="David" w:hAnsi="David" w:cs="David" w:hint="cs"/>
+        </w:rPr>
       </w:pPr>
       <w:r>
         <w:rPr>
-          <w:rFonts w:hint="cs"/>
+          <w:rFonts w:ascii="David" w:hAnsi="David" w:cs="David" w:hint="cs"/>
           <w:rtl/>
         </w:rPr>
         <w:t xml:space="preserve">יצירת </w:t>
       </w:r>
       <w:r>
+        <w:rPr>
+          <w:rFonts w:ascii="David" w:hAnsi="David" w:cs="David" w:hint="cs"/>
+        </w:rPr>
         <w:t>Team</w:t>
       </w:r>
       <w:r>
         <w:rPr>
-          <w:rFonts w:hint="cs"/>
+          <w:rFonts w:ascii="David" w:hAnsi="David" w:cs="David" w:hint="cs"/>
           <w:rtl/>
         </w:rPr>
-        <w:t xml:space="preserve"> וחיבור אנשי צוות למערכת </w:t>
-      </w:r>
-      <w:r>
-        <w:rPr>
-          <w:rtl/>
-        </w:rPr>
-        <w:t>–</w:t>
-      </w:r>
-      <w:r>
-        <w:rPr>
-          <w:rFonts w:hint="cs"/>
-          <w:rtl/>
-        </w:rPr>
-        <w:t xml:space="preserve"> לחשוב מה אפשר לעשות עם זה</w:t>
+        <w:t xml:space="preserve"> וחיבור אנשי צוות למערכת – לחשוב מה אפשר לעשות עם זה</w:t>
       </w:r>
     </w:p>
     <w:p>
@@ -103,10 +84,13 @@
           <w:numId w:val="1"/>
         </w:numPr>
         <w:bidi/>
+        <w:rPr>
+          <w:rFonts w:ascii="David" w:hAnsi="David" w:cs="David" w:hint="cs"/>
+        </w:rPr>
       </w:pPr>
       <w:r>
         <w:rPr>
-          <w:rFonts w:hint="cs"/>
+          <w:rFonts w:ascii="David" w:hAnsi="David" w:cs="David" w:hint="cs"/>
           <w:rtl/>
         </w:rPr>
         <w:t xml:space="preserve">קישור </w:t>
@@ -114,7 +98,7 @@
       <w:proofErr w:type="spellStart"/>
       <w:r>
         <w:rPr>
-          <w:rFonts w:hint="cs"/>
+          <w:rFonts w:ascii="David" w:hAnsi="David" w:cs="David" w:hint="cs"/>
           <w:rtl/>
         </w:rPr>
         <w:t>לווצאפ</w:t>
@@ -122,28 +106,15 @@
       <w:proofErr w:type="spellEnd"/>
       <w:r>
         <w:rPr>
-          <w:rFonts w:hint="cs"/>
+          <w:rFonts w:ascii="David" w:hAnsi="David" w:cs="David" w:hint="cs"/>
           <w:rtl/>
         </w:rPr>
-        <w:t xml:space="preserve"> </w:t>
-      </w:r>
-      <w:r>
-        <w:rPr>
-          <w:rtl/>
-        </w:rPr>
-        <w:t>–</w:t>
-      </w:r>
-      <w:r>
-        <w:rPr>
-          <w:rFonts w:hint="cs"/>
-          <w:rtl/>
-        </w:rPr>
-        <w:t xml:space="preserve"> לשלוח הודעה לחגי </w:t>
+        <w:t xml:space="preserve"> – לשלוח הודעה לחגי </w:t>
       </w:r>
       <w:proofErr w:type="spellStart"/>
       <w:r>
         <w:rPr>
-          <w:rFonts w:hint="cs"/>
+          <w:rFonts w:ascii="David" w:hAnsi="David" w:cs="David" w:hint="cs"/>
           <w:rtl/>
         </w:rPr>
         <w:t>וסיצינה</w:t>
@@ -158,10 +129,13 @@
           <w:numId w:val="1"/>
         </w:numPr>
         <w:bidi/>
+        <w:rPr>
+          <w:rFonts w:ascii="David" w:hAnsi="David" w:cs="David" w:hint="cs"/>
+        </w:rPr>
       </w:pPr>
       <w:r>
         <w:rPr>
-          <w:rFonts w:hint="cs"/>
+          <w:rFonts w:ascii="David" w:hAnsi="David" w:cs="David" w:hint="cs"/>
           <w:rtl/>
         </w:rPr>
         <w:t xml:space="preserve">לעשות כפתור קטן ליד הדברים בלוגיסטיקה שמייצרים משימות (נגיד לסגור עם </w:t>
@@ -169,7 +143,7 @@
       <w:proofErr w:type="spellStart"/>
       <w:r>
         <w:rPr>
-          <w:rFonts w:hint="cs"/>
+          <w:rFonts w:ascii="David" w:hAnsi="David" w:cs="David" w:hint="cs"/>
           <w:rtl/>
         </w:rPr>
         <w:t>סיצינה</w:t>
@@ -177,7 +151,7 @@
       <w:proofErr w:type="spellEnd"/>
       <w:r>
         <w:rPr>
-          <w:rFonts w:hint="cs"/>
+          <w:rFonts w:ascii="David" w:hAnsi="David" w:cs="David" w:hint="cs"/>
           <w:rtl/>
         </w:rPr>
         <w:t>) בלוח משימות</w:t>
@@ -191,21 +165,71 @@
           <w:numId w:val="1"/>
         </w:numPr>
         <w:bidi/>
+        <w:rPr>
+          <w:rFonts w:ascii="David" w:hAnsi="David" w:cs="David" w:hint="cs"/>
+        </w:rPr>
       </w:pPr>
       <w:r>
         <w:rPr>
-          <w:rFonts w:hint="cs"/>
+          <w:rFonts w:ascii="David" w:hAnsi="David" w:cs="David" w:hint="cs"/>
           <w:rtl/>
         </w:rPr>
         <w:t xml:space="preserve">להוסיף ב </w:t>
       </w:r>
       <w:proofErr w:type="spellStart"/>
       <w:r>
+        <w:rPr>
+          <w:rFonts w:ascii="David" w:hAnsi="David" w:cs="David" w:hint="cs"/>
+        </w:rPr>
         <w:t>showform</w:t>
       </w:r>
       <w:proofErr w:type="spellEnd"/>
       <w:r>
+        <w:rPr>
+          <w:rFonts w:ascii="David" w:hAnsi="David" w:cs="David" w:hint="cs"/>
+        </w:rPr>
         <w:t xml:space="preserve"> today tomorrow</w:t>
+      </w:r>
+    </w:p>
+    <w:p>
+      <w:pPr>
+        <w:bidi/>
+        <w:rPr>
+          <w:rFonts w:ascii="David" w:hAnsi="David" w:cs="David" w:hint="cs"/>
+        </w:rPr>
+      </w:pPr>
+    </w:p>
+    <w:p>
+      <w:pPr>
+        <w:bidi/>
+        <w:rPr>
+          <w:rFonts w:ascii="David" w:hAnsi="David" w:cs="David"/>
+          <w:rtl/>
+        </w:rPr>
+      </w:pPr>
+      <w:r>
+        <w:rPr>
+          <w:rFonts w:ascii="David" w:hAnsi="David" w:cs="David" w:hint="cs"/>
+          <w:b/>
+          <w:bCs/>
+          <w:rtl/>
+        </w:rPr>
+        <w:t>12.8 סטטוס פיתוחים:</w:t>
+      </w:r>
+    </w:p>
+    <w:p>
+      <w:pPr>
+        <w:bidi/>
+        <w:rPr>
+          <w:rFonts w:ascii="David" w:hAnsi="David" w:cs="David"/>
+        </w:rPr>
+      </w:pPr>
+      <w:r>
+        <w:rPr>
+          <w:rFonts w:ascii="David" w:hAnsi="David" w:cs="David" w:hint="cs"/>
+          <w:rtl/>
+        </w:rPr>
+        <w:t xml:space="preserve">כפתור החלפת שפה - </w:t>
       </w:r>
     </w:p>
     <w:sectPr>

</xml_diff>